<commit_message>
Correct to end OTIS 2,3,4
</commit_message>
<xml_diff>
--- a/course-2_semester-1/OTIS/ОТИС (3).docx
+++ b/course-2_semester-1/OTIS/ОТИС (3).docx
@@ -4197,16 +4197,7 @@
                       <w:szCs w:val="24"/>
                       <w:lang w:val="en-US"/>
                     </w:rPr>
-                    <m:t>0.</m:t>
-                  </m:r>
-                  <m:r>
-                    <w:rPr>
-                      <w:rFonts w:ascii="Cambria Math" w:hAnsi="Cambria Math" w:cs="Segoe UI"/>
-                      <w:sz w:val="24"/>
-                      <w:szCs w:val="24"/>
-                      <w:lang w:val="en-US"/>
-                    </w:rPr>
-                    <m:t>2</m:t>
+                    <m:t>0.2</m:t>
                   </m:r>
                 </m:num>
                 <m:den>
@@ -4265,25 +4256,7 @@
                           <w:szCs w:val="24"/>
                           <w:lang w:val="en-US"/>
                         </w:rPr>
-                        <m:t>3</m:t>
-                      </m:r>
-                      <m:r>
-                        <w:rPr>
-                          <w:rFonts w:ascii="Cambria Math" w:hAnsi="Cambria Math" w:cs="Segoe UI"/>
-                          <w:sz w:val="24"/>
-                          <w:szCs w:val="24"/>
-                          <w:lang w:val="en-US"/>
-                        </w:rPr>
-                        <m:t>-</m:t>
-                      </m:r>
-                      <m:r>
-                        <w:rPr>
-                          <w:rFonts w:ascii="Cambria Math" w:hAnsi="Cambria Math" w:cs="Segoe UI"/>
-                          <w:sz w:val="24"/>
-                          <w:szCs w:val="24"/>
-                          <w:lang w:val="en-US"/>
-                        </w:rPr>
-                        <m:t>5</m:t>
+                        <m:t>3-5</m:t>
                       </m:r>
                     </m:e>
                   </m:d>
@@ -4388,16 +4361,7 @@
                           <w:szCs w:val="24"/>
                           <w:lang w:val="en-US"/>
                         </w:rPr>
-                        <m:t>2</m:t>
-                      </m:r>
-                      <m:r>
-                        <w:rPr>
-                          <w:rFonts w:ascii="Cambria Math" w:hAnsi="Cambria Math" w:cs="Segoe UI"/>
-                          <w:sz w:val="24"/>
-                          <w:szCs w:val="24"/>
-                          <w:lang w:val="en-US"/>
-                        </w:rPr>
-                        <m:t>-5</m:t>
+                        <m:t>2-5</m:t>
                       </m:r>
                     </m:e>
                   </m:d>
@@ -4502,16 +4466,7 @@
                           <w:szCs w:val="24"/>
                           <w:lang w:val="en-US"/>
                         </w:rPr>
-                        <m:t>3</m:t>
-                      </m:r>
-                      <m:r>
-                        <w:rPr>
-                          <w:rFonts w:ascii="Cambria Math" w:hAnsi="Cambria Math" w:cs="Segoe UI"/>
-                          <w:sz w:val="24"/>
-                          <w:szCs w:val="24"/>
-                          <w:lang w:val="en-US"/>
-                        </w:rPr>
-                        <m:t>-4</m:t>
+                        <m:t>3-4</m:t>
                       </m:r>
                     </m:e>
                   </m:d>
@@ -4738,25 +4693,7 @@
                           <w:szCs w:val="24"/>
                           <w:lang w:val="en-US"/>
                         </w:rPr>
-                        <m:t>5</m:t>
-                      </m:r>
-                      <m:r>
-                        <w:rPr>
-                          <w:rFonts w:ascii="Cambria Math" w:hAnsi="Cambria Math" w:cs="Segoe UI"/>
-                          <w:sz w:val="24"/>
-                          <w:szCs w:val="24"/>
-                          <w:lang w:val="en-US"/>
-                        </w:rPr>
-                        <m:t>-</m:t>
-                      </m:r>
-                      <m:r>
-                        <w:rPr>
-                          <w:rFonts w:ascii="Cambria Math" w:hAnsi="Cambria Math" w:cs="Segoe UI"/>
-                          <w:sz w:val="24"/>
-                          <w:szCs w:val="24"/>
-                          <w:lang w:val="en-US"/>
-                        </w:rPr>
-                        <m:t>3</m:t>
+                        <m:t>5-3</m:t>
                       </m:r>
                     </m:e>
                   </m:d>
@@ -4782,16 +4719,7 @@
               <w:szCs w:val="24"/>
               <w:lang w:val="en-US"/>
             </w:rPr>
-            <m:t>=</m:t>
-          </m:r>
-          <m:r>
-            <w:rPr>
-              <w:rFonts w:ascii="Cambria Math" w:hAnsi="Cambria Math" w:cs="Segoe UI"/>
-              <w:sz w:val="24"/>
-              <w:szCs w:val="24"/>
-              <w:lang w:val="en-US"/>
-            </w:rPr>
-            <m:t>4</m:t>
+            <m:t>=4</m:t>
           </m:r>
           <m:r>
             <w:rPr>
@@ -4808,16 +4736,7 @@
               <w:szCs w:val="24"/>
               <w:lang w:val="en-US"/>
             </w:rPr>
-            <m:t>27</m:t>
-          </m:r>
-          <m:r>
-            <w:rPr>
-              <w:rFonts w:ascii="Cambria Math" w:hAnsi="Cambria Math" w:cs="Segoe UI"/>
-              <w:sz w:val="24"/>
-              <w:szCs w:val="24"/>
-              <w:lang w:val="en-US"/>
-            </w:rPr>
-            <m:t xml:space="preserve"> </m:t>
+            <m:t xml:space="preserve">27 </m:t>
           </m:r>
         </m:oMath>
       </m:oMathPara>
@@ -4913,16 +4832,7 @@
                       <w:szCs w:val="24"/>
                       <w:lang w:val="en-US"/>
                     </w:rPr>
-                    <m:t>0.</m:t>
-                  </m:r>
-                  <m:r>
-                    <w:rPr>
-                      <w:rFonts w:ascii="Cambria Math" w:hAnsi="Cambria Math" w:cs="Segoe UI"/>
-                      <w:sz w:val="24"/>
-                      <w:szCs w:val="24"/>
-                      <w:lang w:val="en-US"/>
-                    </w:rPr>
-                    <m:t>2</m:t>
+                    <m:t>0.2</m:t>
                   </m:r>
                 </m:num>
                 <m:den>
@@ -4981,25 +4891,7 @@
                           <w:szCs w:val="24"/>
                           <w:lang w:val="en-US"/>
                         </w:rPr>
-                        <m:t>2</m:t>
-                      </m:r>
-                      <m:r>
-                        <w:rPr>
-                          <w:rFonts w:ascii="Cambria Math" w:hAnsi="Cambria Math" w:cs="Segoe UI"/>
-                          <w:sz w:val="24"/>
-                          <w:szCs w:val="24"/>
-                          <w:lang w:val="en-US"/>
-                        </w:rPr>
-                        <m:t>-</m:t>
-                      </m:r>
-                      <m:r>
-                        <w:rPr>
-                          <w:rFonts w:ascii="Cambria Math" w:hAnsi="Cambria Math" w:cs="Segoe UI"/>
-                          <w:sz w:val="24"/>
-                          <w:szCs w:val="24"/>
-                          <w:lang w:val="en-US"/>
-                        </w:rPr>
-                        <m:t>5</m:t>
+                        <m:t>2-5</m:t>
                       </m:r>
                     </m:e>
                   </m:d>
@@ -5104,16 +4996,7 @@
                           <w:szCs w:val="24"/>
                           <w:lang w:val="en-US"/>
                         </w:rPr>
-                        <m:t>3</m:t>
-                      </m:r>
-                      <m:r>
-                        <w:rPr>
-                          <w:rFonts w:ascii="Cambria Math" w:hAnsi="Cambria Math" w:cs="Segoe UI"/>
-                          <w:sz w:val="24"/>
-                          <w:szCs w:val="24"/>
-                          <w:lang w:val="en-US"/>
-                        </w:rPr>
-                        <m:t>-5</m:t>
+                        <m:t>3-5</m:t>
                       </m:r>
                     </m:e>
                   </m:d>
@@ -5323,25 +5206,7 @@
                           <w:szCs w:val="24"/>
                           <w:lang w:val="en-US"/>
                         </w:rPr>
-                        <m:t>4</m:t>
-                      </m:r>
-                      <m:r>
-                        <w:rPr>
-                          <w:rFonts w:ascii="Cambria Math" w:hAnsi="Cambria Math" w:cs="Segoe UI"/>
-                          <w:sz w:val="24"/>
-                          <w:szCs w:val="24"/>
-                          <w:lang w:val="en-US"/>
-                        </w:rPr>
-                        <m:t>-</m:t>
-                      </m:r>
-                      <m:r>
-                        <w:rPr>
-                          <w:rFonts w:ascii="Cambria Math" w:hAnsi="Cambria Math" w:cs="Segoe UI"/>
-                          <w:sz w:val="24"/>
-                          <w:szCs w:val="24"/>
-                          <w:lang w:val="en-US"/>
-                        </w:rPr>
-                        <m:t>4</m:t>
+                        <m:t>4-4</m:t>
                       </m:r>
                     </m:e>
                   </m:d>
@@ -5446,16 +5311,7 @@
                           <w:szCs w:val="24"/>
                           <w:lang w:val="en-US"/>
                         </w:rPr>
-                        <m:t>3-</m:t>
-                      </m:r>
-                      <m:r>
-                        <w:rPr>
-                          <w:rFonts w:ascii="Cambria Math" w:hAnsi="Cambria Math" w:cs="Segoe UI"/>
-                          <w:sz w:val="24"/>
-                          <w:szCs w:val="24"/>
-                          <w:lang w:val="en-US"/>
-                        </w:rPr>
-                        <m:t>3</m:t>
+                        <m:t>3-3</m:t>
                       </m:r>
                     </m:e>
                   </m:d>
@@ -5481,16 +5337,7 @@
               <w:szCs w:val="24"/>
               <w:lang w:val="en-US"/>
             </w:rPr>
-            <m:t>= 4.</m:t>
-          </m:r>
-          <m:r>
-            <w:rPr>
-              <w:rFonts w:ascii="Cambria Math" w:hAnsi="Cambria Math" w:cs="Segoe UI"/>
-              <w:sz w:val="24"/>
-              <w:szCs w:val="24"/>
-              <w:lang w:val="en-US"/>
-            </w:rPr>
-            <m:t>15</m:t>
+            <m:t>= 4.15</m:t>
           </m:r>
         </m:oMath>
       </m:oMathPara>
@@ -5586,16 +5433,7 @@
                       <w:szCs w:val="24"/>
                       <w:lang w:val="en-US"/>
                     </w:rPr>
-                    <m:t>0.</m:t>
-                  </m:r>
-                  <m:r>
-                    <w:rPr>
-                      <w:rFonts w:ascii="Cambria Math" w:hAnsi="Cambria Math" w:cs="Segoe UI"/>
-                      <w:sz w:val="24"/>
-                      <w:szCs w:val="24"/>
-                      <w:lang w:val="en-US"/>
-                    </w:rPr>
-                    <m:t>2</m:t>
+                    <m:t>0.2</m:t>
                   </m:r>
                 </m:num>
                 <m:den>
@@ -5654,25 +5492,7 @@
                           <w:szCs w:val="24"/>
                           <w:lang w:val="en-US"/>
                         </w:rPr>
-                        <m:t>1</m:t>
-                      </m:r>
-                      <m:r>
-                        <w:rPr>
-                          <w:rFonts w:ascii="Cambria Math" w:hAnsi="Cambria Math" w:cs="Segoe UI"/>
-                          <w:sz w:val="24"/>
-                          <w:szCs w:val="24"/>
-                          <w:lang w:val="en-US"/>
-                        </w:rPr>
-                        <m:t>-</m:t>
-                      </m:r>
-                      <m:r>
-                        <w:rPr>
-                          <w:rFonts w:ascii="Cambria Math" w:hAnsi="Cambria Math" w:cs="Segoe UI"/>
-                          <w:sz w:val="24"/>
-                          <w:szCs w:val="24"/>
-                          <w:lang w:val="en-US"/>
-                        </w:rPr>
-                        <m:t>5</m:t>
+                        <m:t>1-5</m:t>
                       </m:r>
                     </m:e>
                   </m:d>
@@ -5777,16 +5597,7 @@
                           <w:szCs w:val="24"/>
                           <w:lang w:val="en-US"/>
                         </w:rPr>
-                        <m:t>5</m:t>
-                      </m:r>
-                      <m:r>
-                        <w:rPr>
-                          <w:rFonts w:ascii="Cambria Math" w:hAnsi="Cambria Math" w:cs="Segoe UI"/>
-                          <w:sz w:val="24"/>
-                          <w:szCs w:val="24"/>
-                          <w:lang w:val="en-US"/>
-                        </w:rPr>
-                        <m:t>-5</m:t>
+                        <m:t>5-5</m:t>
                       </m:r>
                     </m:e>
                   </m:d>
@@ -5891,16 +5702,7 @@
                           <w:szCs w:val="24"/>
                           <w:lang w:val="en-US"/>
                         </w:rPr>
-                        <m:t>1</m:t>
-                      </m:r>
-                      <m:r>
-                        <w:rPr>
-                          <w:rFonts w:ascii="Cambria Math" w:hAnsi="Cambria Math" w:cs="Segoe UI"/>
-                          <w:sz w:val="24"/>
-                          <w:szCs w:val="24"/>
-                          <w:lang w:val="en-US"/>
-                        </w:rPr>
-                        <m:t>-4</m:t>
+                        <m:t>1-4</m:t>
                       </m:r>
                     </m:e>
                   </m:d>
@@ -6005,25 +5807,7 @@
                           <w:szCs w:val="24"/>
                           <w:lang w:val="en-US"/>
                         </w:rPr>
-                        <m:t>2</m:t>
-                      </m:r>
-                      <m:r>
-                        <w:rPr>
-                          <w:rFonts w:ascii="Cambria Math" w:hAnsi="Cambria Math" w:cs="Segoe UI"/>
-                          <w:sz w:val="24"/>
-                          <w:szCs w:val="24"/>
-                          <w:lang w:val="en-US"/>
-                        </w:rPr>
-                        <m:t>-</m:t>
-                      </m:r>
-                      <m:r>
-                        <w:rPr>
-                          <w:rFonts w:ascii="Cambria Math" w:hAnsi="Cambria Math" w:cs="Segoe UI"/>
-                          <w:sz w:val="24"/>
-                          <w:szCs w:val="24"/>
-                          <w:lang w:val="en-US"/>
-                        </w:rPr>
-                        <m:t>4</m:t>
+                        <m:t>2-4</m:t>
                       </m:r>
                     </m:e>
                   </m:d>
@@ -6128,16 +5912,7 @@
                           <w:szCs w:val="24"/>
                           <w:lang w:val="en-US"/>
                         </w:rPr>
-                        <m:t>1</m:t>
-                      </m:r>
-                      <m:r>
-                        <w:rPr>
-                          <w:rFonts w:ascii="Cambria Math" w:hAnsi="Cambria Math" w:cs="Segoe UI"/>
-                          <w:sz w:val="24"/>
-                          <w:szCs w:val="24"/>
-                          <w:lang w:val="en-US"/>
-                        </w:rPr>
-                        <m:t>-3</m:t>
+                        <m:t>1-3</m:t>
                       </m:r>
                     </m:e>
                   </m:d>
@@ -6163,16 +5938,7 @@
               <w:szCs w:val="24"/>
               <w:lang w:val="en-US"/>
             </w:rPr>
-            <m:t xml:space="preserve">= </m:t>
-          </m:r>
-          <m:r>
-            <w:rPr>
-              <w:rFonts w:ascii="Cambria Math" w:hAnsi="Cambria Math" w:cs="Segoe UI"/>
-              <w:sz w:val="24"/>
-              <w:szCs w:val="24"/>
-              <w:lang w:val="en-US"/>
-            </w:rPr>
-            <m:t>5.77</m:t>
+            <m:t>= 5.77</m:t>
           </m:r>
         </m:oMath>
       </m:oMathPara>
@@ -6267,16 +6033,7 @@
                       <w:szCs w:val="24"/>
                       <w:lang w:val="en-US"/>
                     </w:rPr>
-                    <m:t>0.</m:t>
-                  </m:r>
-                  <m:r>
-                    <w:rPr>
-                      <w:rFonts w:ascii="Cambria Math" w:hAnsi="Cambria Math" w:cs="Segoe UI"/>
-                      <w:sz w:val="24"/>
-                      <w:szCs w:val="24"/>
-                      <w:lang w:val="en-US"/>
-                    </w:rPr>
-                    <m:t>2</m:t>
+                    <m:t>0.2</m:t>
                   </m:r>
                 </m:num>
                 <m:den>
@@ -6335,25 +6092,7 @@
                           <w:szCs w:val="24"/>
                           <w:lang w:val="en-US"/>
                         </w:rPr>
-                        <m:t>2</m:t>
-                      </m:r>
-                      <m:r>
-                        <w:rPr>
-                          <w:rFonts w:ascii="Cambria Math" w:hAnsi="Cambria Math" w:cs="Segoe UI"/>
-                          <w:sz w:val="24"/>
-                          <w:szCs w:val="24"/>
-                          <w:lang w:val="en-US"/>
-                        </w:rPr>
-                        <m:t>-</m:t>
-                      </m:r>
-                      <m:r>
-                        <w:rPr>
-                          <w:rFonts w:ascii="Cambria Math" w:hAnsi="Cambria Math" w:cs="Segoe UI"/>
-                          <w:sz w:val="24"/>
-                          <w:szCs w:val="24"/>
-                          <w:lang w:val="en-US"/>
-                        </w:rPr>
-                        <m:t>5</m:t>
+                        <m:t>2-5</m:t>
                       </m:r>
                     </m:e>
                   </m:d>
@@ -6563,16 +6302,7 @@
                           <w:szCs w:val="24"/>
                           <w:lang w:val="en-US"/>
                         </w:rPr>
-                        <m:t>3</m:t>
-                      </m:r>
-                      <m:r>
-                        <w:rPr>
-                          <w:rFonts w:ascii="Cambria Math" w:hAnsi="Cambria Math" w:cs="Segoe UI"/>
-                          <w:sz w:val="24"/>
-                          <w:szCs w:val="24"/>
-                          <w:lang w:val="en-US"/>
-                        </w:rPr>
-                        <m:t>-4</m:t>
+                        <m:t>3-4</m:t>
                       </m:r>
                     </m:e>
                   </m:d>
@@ -6677,25 +6407,7 @@
                           <w:szCs w:val="24"/>
                           <w:lang w:val="en-US"/>
                         </w:rPr>
-                        <m:t>3</m:t>
-                      </m:r>
-                      <m:r>
-                        <w:rPr>
-                          <w:rFonts w:ascii="Cambria Math" w:hAnsi="Cambria Math" w:cs="Segoe UI"/>
-                          <w:sz w:val="24"/>
-                          <w:szCs w:val="24"/>
-                          <w:lang w:val="en-US"/>
-                        </w:rPr>
-                        <m:t>-</m:t>
-                      </m:r>
-                      <m:r>
-                        <w:rPr>
-                          <w:rFonts w:ascii="Cambria Math" w:hAnsi="Cambria Math" w:cs="Segoe UI"/>
-                          <w:sz w:val="24"/>
-                          <w:szCs w:val="24"/>
-                          <w:lang w:val="en-US"/>
-                        </w:rPr>
-                        <m:t>4</m:t>
+                        <m:t>3-4</m:t>
                       </m:r>
                     </m:e>
                   </m:d>
@@ -6800,25 +6512,7 @@
                           <w:szCs w:val="24"/>
                           <w:lang w:val="en-US"/>
                         </w:rPr>
-                        <m:t>2</m:t>
-                      </m:r>
-                      <m:r>
-                        <w:rPr>
-                          <w:rFonts w:ascii="Cambria Math" w:hAnsi="Cambria Math" w:cs="Segoe UI"/>
-                          <w:sz w:val="24"/>
-                          <w:szCs w:val="24"/>
-                          <w:lang w:val="en-US"/>
-                        </w:rPr>
-                        <m:t>-</m:t>
-                      </m:r>
-                      <m:r>
-                        <w:rPr>
-                          <w:rFonts w:ascii="Cambria Math" w:hAnsi="Cambria Math" w:cs="Segoe UI"/>
-                          <w:sz w:val="24"/>
-                          <w:szCs w:val="24"/>
-                          <w:lang w:val="en-US"/>
-                        </w:rPr>
-                        <m:t>3</m:t>
+                        <m:t>2-3</m:t>
                       </m:r>
                     </m:e>
                   </m:d>
@@ -6844,16 +6538,7 @@
               <w:szCs w:val="24"/>
               <w:lang w:val="en-US"/>
             </w:rPr>
-            <m:t xml:space="preserve">= </m:t>
-          </m:r>
-          <m:r>
-            <w:rPr>
-              <w:rFonts w:ascii="Cambria Math" w:hAnsi="Cambria Math" w:cs="Segoe UI"/>
-              <w:sz w:val="24"/>
-              <w:szCs w:val="24"/>
-              <w:lang w:val="en-US"/>
-            </w:rPr>
-            <m:t>4.03</m:t>
+            <m:t>= 4.03</m:t>
           </m:r>
         </m:oMath>
       </m:oMathPara>
@@ -6949,16 +6634,7 @@
                       <w:szCs w:val="24"/>
                       <w:lang w:val="en-US"/>
                     </w:rPr>
-                    <m:t>0.</m:t>
-                  </m:r>
-                  <m:r>
-                    <w:rPr>
-                      <w:rFonts w:ascii="Cambria Math" w:hAnsi="Cambria Math" w:cs="Segoe UI"/>
-                      <w:sz w:val="24"/>
-                      <w:szCs w:val="24"/>
-                      <w:lang w:val="en-US"/>
-                    </w:rPr>
-                    <m:t>2</m:t>
+                    <m:t>0.2</m:t>
                   </m:r>
                 </m:num>
                 <m:den>
@@ -7017,16 +6693,7 @@
                           <w:szCs w:val="24"/>
                           <w:lang w:val="en-US"/>
                         </w:rPr>
-                        <m:t>2-</m:t>
-                      </m:r>
-                      <m:r>
-                        <w:rPr>
-                          <w:rFonts w:ascii="Cambria Math" w:hAnsi="Cambria Math" w:cs="Segoe UI"/>
-                          <w:sz w:val="24"/>
-                          <w:szCs w:val="24"/>
-                          <w:lang w:val="en-US"/>
-                        </w:rPr>
-                        <m:t>5</m:t>
+                        <m:t>2-5</m:t>
                       </m:r>
                     </m:e>
                   </m:d>
@@ -7131,16 +6798,7 @@
                           <w:szCs w:val="24"/>
                           <w:lang w:val="en-US"/>
                         </w:rPr>
-                        <m:t>4</m:t>
-                      </m:r>
-                      <m:r>
-                        <w:rPr>
-                          <w:rFonts w:ascii="Cambria Math" w:hAnsi="Cambria Math" w:cs="Segoe UI"/>
-                          <w:sz w:val="24"/>
-                          <w:szCs w:val="24"/>
-                          <w:lang w:val="en-US"/>
-                        </w:rPr>
-                        <m:t>-5</m:t>
+                        <m:t>4-5</m:t>
                       </m:r>
                     </m:e>
                   </m:d>
@@ -7350,16 +7008,7 @@
                           <w:szCs w:val="24"/>
                           <w:lang w:val="en-US"/>
                         </w:rPr>
-                        <m:t>4-</m:t>
-                      </m:r>
-                      <m:r>
-                        <w:rPr>
-                          <w:rFonts w:ascii="Cambria Math" w:hAnsi="Cambria Math" w:cs="Segoe UI"/>
-                          <w:sz w:val="24"/>
-                          <w:szCs w:val="24"/>
-                          <w:lang w:val="en-US"/>
-                        </w:rPr>
-                        <m:t>4</m:t>
+                        <m:t>4-4</m:t>
                       </m:r>
                     </m:e>
                   </m:d>
@@ -7464,25 +7113,7 @@
                           <w:szCs w:val="24"/>
                           <w:lang w:val="en-US"/>
                         </w:rPr>
-                        <m:t>2</m:t>
-                      </m:r>
-                      <m:r>
-                        <w:rPr>
-                          <w:rFonts w:ascii="Cambria Math" w:hAnsi="Cambria Math" w:cs="Segoe UI"/>
-                          <w:sz w:val="24"/>
-                          <w:szCs w:val="24"/>
-                          <w:lang w:val="en-US"/>
-                        </w:rPr>
-                        <m:t>-</m:t>
-                      </m:r>
-                      <m:r>
-                        <w:rPr>
-                          <w:rFonts w:ascii="Cambria Math" w:hAnsi="Cambria Math" w:cs="Segoe UI"/>
-                          <w:sz w:val="24"/>
-                          <w:szCs w:val="24"/>
-                          <w:lang w:val="en-US"/>
-                        </w:rPr>
-                        <m:t>3</m:t>
+                        <m:t>2-3</m:t>
                       </m:r>
                     </m:e>
                   </m:d>
@@ -9104,7 +8735,7 @@
           <w:sz w:val="24"/>
           <w:szCs w:val="24"/>
         </w:rPr>
-        <w:t xml:space="preserve">). Судя по графику, лучшими из </w:t>
+        <w:t xml:space="preserve">). Судя по графику, лучшим из </w:t>
       </w:r>
       <w:r>
         <w:rPr>
@@ -9113,7 +8744,7 @@
           <w:sz w:val="24"/>
           <w:szCs w:val="24"/>
         </w:rPr>
-        <w:t xml:space="preserve">выбранных систем будут системы </w:t>
+        <w:t>выбранных систем буд</w:t>
       </w:r>
       <w:r>
         <w:rPr>
@@ -9122,7 +8753,7 @@
           <w:sz w:val="24"/>
           <w:szCs w:val="24"/>
         </w:rPr>
-        <w:t>2</w:t>
+        <w:t>ет</w:t>
       </w:r>
       <w:r>
         <w:rPr>
@@ -9131,7 +8762,7 @@
           <w:sz w:val="24"/>
           <w:szCs w:val="24"/>
         </w:rPr>
-        <w:t xml:space="preserve">, </w:t>
+        <w:t xml:space="preserve"> систем</w:t>
       </w:r>
       <w:r>
         <w:rPr>
@@ -9140,16 +8771,7 @@
           <w:sz w:val="24"/>
           <w:szCs w:val="24"/>
         </w:rPr>
-        <w:t>4</w:t>
-      </w:r>
-      <w:r>
-        <w:rPr>
-          <w:rFonts w:ascii="Candara" w:hAnsi="Candara" w:cs="Segoe UI"/>
-          <w:color w:val="000000"/>
-          <w:sz w:val="24"/>
-          <w:szCs w:val="24"/>
-        </w:rPr>
-        <w:t xml:space="preserve"> и </w:t>
+        <w:t xml:space="preserve">а </w:t>
       </w:r>
       <w:r>
         <w:rPr>

</xml_diff>